<commit_message>
Uploading more .html files
</commit_message>
<xml_diff>
--- a/Trinitrobenzene/Trinitrobenzene.docx
+++ b/Trinitrobenzene/Trinitrobenzene.docx
@@ -71,7 +71,7 @@
           <v:shape id="_x0000_i1025" type="#_x0000_t75" style="width:111pt;height:101.25pt" o:ole="">
             <v:imagedata r:id="rId6" o:title=""/>
           </v:shape>
-          <o:OLEObject Type="Embed" ProgID="ACD.ChemSketch.20" ShapeID="_x0000_i1025" DrawAspect="Content" ObjectID="_1798293071" r:id="rId7"/>
+          <o:OLEObject Type="Embed" ProgID="ACD.ChemSketch.20" ShapeID="_x0000_i1025" DrawAspect="Content" ObjectID="_1846674884" r:id="rId7"/>
         </w:object>
       </w:r>
     </w:p>
@@ -188,7 +188,21 @@
         <w:rPr>
           <w:lang w:val="en-US"/>
         </w:rPr>
-        <w:t xml:space="preserve">  Matches to forms I and II could only be achieved by increasing the tolerances in Compack.</w:t>
+        <w:t xml:space="preserve">  Matches to forms I and II could only be achieved by increasing the tolerances in </w:t>
+      </w:r>
+      <w:proofErr w:type="spellStart"/>
+      <w:r>
+        <w:rPr>
+          <w:lang w:val="en-US"/>
+        </w:rPr>
+        <w:t>Compack</w:t>
+      </w:r>
+      <w:proofErr w:type="spellEnd"/>
+      <w:r>
+        <w:rPr>
+          <w:lang w:val="en-US"/>
+        </w:rPr>
+        <w:t>.</w:t>
       </w:r>
     </w:p>
     <w:p>
@@ -201,7 +215,21 @@
         <w:rPr>
           <w:lang w:val="en-US"/>
         </w:rPr>
-        <w:t>For all searches, a single CrystalPredictor search was carried out, followed by DMACRYS optimization with the appropriate potential.</w:t>
+        <w:t xml:space="preserve">For all searches, a single </w:t>
+      </w:r>
+      <w:proofErr w:type="spellStart"/>
+      <w:r>
+        <w:rPr>
+          <w:lang w:val="en-US"/>
+        </w:rPr>
+        <w:t>CrystalPredictor</w:t>
+      </w:r>
+      <w:proofErr w:type="spellEnd"/>
+      <w:r>
+        <w:rPr>
+          <w:lang w:val="en-US"/>
+        </w:rPr>
+        <w:t xml:space="preserve"> search was carried out, followed by DMACRYS optimization with the appropriate potential.</w:t>
       </w:r>
     </w:p>
     <w:tbl>
@@ -232,7 +260,6 @@
               <w:top w:val="single" w:sz="24" w:space="0" w:color="auto"/>
               <w:left w:val="single" w:sz="24" w:space="0" w:color="auto"/>
             </w:tcBorders>
-            <w:shd w:val="clear" w:color="auto" w:fill="auto"/>
             <w:noWrap/>
             <w:vAlign w:val="bottom"/>
             <w:hideMark/>
@@ -265,7 +292,6 @@
               <w:top w:val="single" w:sz="24" w:space="0" w:color="auto"/>
               <w:right w:val="single" w:sz="24" w:space="0" w:color="auto"/>
             </w:tcBorders>
-            <w:shd w:val="clear" w:color="auto" w:fill="auto"/>
             <w:noWrap/>
             <w:vAlign w:val="bottom"/>
             <w:hideMark/>
@@ -302,7 +328,6 @@
             <w:tcBorders>
               <w:left w:val="single" w:sz="24" w:space="0" w:color="auto"/>
             </w:tcBorders>
-            <w:shd w:val="clear" w:color="auto" w:fill="auto"/>
             <w:noWrap/>
             <w:vAlign w:val="bottom"/>
             <w:hideMark/>
@@ -334,7 +359,6 @@
             <w:tcBorders>
               <w:right w:val="single" w:sz="24" w:space="0" w:color="auto"/>
             </w:tcBorders>
-            <w:shd w:val="clear" w:color="auto" w:fill="auto"/>
             <w:noWrap/>
             <w:vAlign w:val="bottom"/>
             <w:hideMark/>
@@ -371,7 +395,6 @@
             <w:tcBorders>
               <w:left w:val="single" w:sz="24" w:space="0" w:color="auto"/>
             </w:tcBorders>
-            <w:shd w:val="clear" w:color="auto" w:fill="auto"/>
             <w:noWrap/>
             <w:vAlign w:val="bottom"/>
             <w:hideMark/>
@@ -403,7 +426,6 @@
             <w:tcBorders>
               <w:right w:val="single" w:sz="24" w:space="0" w:color="auto"/>
             </w:tcBorders>
-            <w:shd w:val="clear" w:color="auto" w:fill="auto"/>
             <w:noWrap/>
             <w:vAlign w:val="bottom"/>
             <w:hideMark/>
@@ -440,7 +462,6 @@
             <w:tcBorders>
               <w:left w:val="single" w:sz="24" w:space="0" w:color="auto"/>
             </w:tcBorders>
-            <w:shd w:val="clear" w:color="auto" w:fill="auto"/>
             <w:noWrap/>
             <w:vAlign w:val="bottom"/>
             <w:hideMark/>
@@ -472,7 +493,6 @@
             <w:tcBorders>
               <w:right w:val="single" w:sz="24" w:space="0" w:color="auto"/>
             </w:tcBorders>
-            <w:shd w:val="clear" w:color="auto" w:fill="auto"/>
             <w:noWrap/>
             <w:vAlign w:val="bottom"/>
             <w:hideMark/>
@@ -510,7 +530,6 @@
               <w:left w:val="single" w:sz="24" w:space="0" w:color="auto"/>
               <w:bottom w:val="single" w:sz="24" w:space="0" w:color="auto"/>
             </w:tcBorders>
-            <w:shd w:val="clear" w:color="auto" w:fill="auto"/>
             <w:noWrap/>
             <w:vAlign w:val="bottom"/>
             <w:hideMark/>
@@ -532,8 +551,19 @@
                 <w:szCs w:val="20"/>
                 <w:lang w:eastAsia="en-GB"/>
               </w:rPr>
-              <w:t>CSD Refcodes</w:t>
-            </w:r>
+              <w:t xml:space="preserve">CSD </w:t>
+            </w:r>
+            <w:proofErr w:type="spellStart"/>
+            <w:r>
+              <w:rPr>
+                <w:rFonts w:ascii="Arial" w:eastAsia="Times New Roman" w:hAnsi="Arial" w:cs="Arial"/>
+                <w:sz w:val="20"/>
+                <w:szCs w:val="20"/>
+                <w:lang w:eastAsia="en-GB"/>
+              </w:rPr>
+              <w:t>Refcodes</w:t>
+            </w:r>
+            <w:proofErr w:type="spellEnd"/>
           </w:p>
         </w:tc>
         <w:tc>
@@ -543,7 +573,6 @@
               <w:bottom w:val="single" w:sz="24" w:space="0" w:color="auto"/>
               <w:right w:val="single" w:sz="24" w:space="0" w:color="auto"/>
             </w:tcBorders>
-            <w:shd w:val="clear" w:color="auto" w:fill="auto"/>
             <w:noWrap/>
             <w:vAlign w:val="bottom"/>
             <w:hideMark/>
@@ -581,7 +610,6 @@
               <w:top w:val="single" w:sz="24" w:space="0" w:color="auto"/>
               <w:bottom w:val="single" w:sz="24" w:space="0" w:color="FF0000"/>
             </w:tcBorders>
-            <w:shd w:val="clear" w:color="auto" w:fill="auto"/>
             <w:noWrap/>
             <w:vAlign w:val="bottom"/>
           </w:tcPr>
@@ -604,7 +632,6 @@
               <w:top w:val="single" w:sz="24" w:space="0" w:color="auto"/>
               <w:bottom w:val="single" w:sz="24" w:space="0" w:color="FF0000"/>
             </w:tcBorders>
-            <w:shd w:val="clear" w:color="auto" w:fill="auto"/>
             <w:noWrap/>
             <w:vAlign w:val="bottom"/>
           </w:tcPr>
@@ -632,7 +659,6 @@
               <w:top w:val="single" w:sz="24" w:space="0" w:color="FF0000"/>
               <w:left w:val="single" w:sz="24" w:space="0" w:color="FF0000"/>
             </w:tcBorders>
-            <w:shd w:val="clear" w:color="auto" w:fill="auto"/>
             <w:noWrap/>
             <w:vAlign w:val="bottom"/>
           </w:tcPr>
@@ -664,7 +690,6 @@
               <w:top w:val="single" w:sz="24" w:space="0" w:color="FF0000"/>
               <w:right w:val="single" w:sz="24" w:space="0" w:color="FF0000"/>
             </w:tcBorders>
-            <w:shd w:val="clear" w:color="auto" w:fill="auto"/>
             <w:noWrap/>
             <w:vAlign w:val="bottom"/>
           </w:tcPr>
@@ -700,7 +725,6 @@
             <w:tcBorders>
               <w:left w:val="single" w:sz="24" w:space="0" w:color="FF0000"/>
             </w:tcBorders>
-            <w:shd w:val="clear" w:color="auto" w:fill="auto"/>
             <w:noWrap/>
             <w:vAlign w:val="bottom"/>
             <w:hideMark/>
@@ -732,7 +756,6 @@
             <w:tcBorders>
               <w:right w:val="single" w:sz="24" w:space="0" w:color="FF0000"/>
             </w:tcBorders>
-            <w:shd w:val="clear" w:color="auto" w:fill="auto"/>
             <w:noWrap/>
             <w:vAlign w:val="bottom"/>
             <w:hideMark/>
@@ -769,7 +792,6 @@
             <w:tcBorders>
               <w:left w:val="single" w:sz="24" w:space="0" w:color="FF0000"/>
             </w:tcBorders>
-            <w:shd w:val="clear" w:color="auto" w:fill="auto"/>
             <w:noWrap/>
             <w:vAlign w:val="bottom"/>
             <w:hideMark/>
@@ -801,7 +823,6 @@
             <w:tcBorders>
               <w:right w:val="single" w:sz="24" w:space="0" w:color="FF0000"/>
             </w:tcBorders>
-            <w:shd w:val="clear" w:color="auto" w:fill="auto"/>
             <w:noWrap/>
             <w:vAlign w:val="bottom"/>
             <w:hideMark/>
@@ -838,7 +859,6 @@
             <w:tcBorders>
               <w:left w:val="single" w:sz="24" w:space="0" w:color="FF0000"/>
             </w:tcBorders>
-            <w:shd w:val="clear" w:color="auto" w:fill="auto"/>
             <w:noWrap/>
             <w:vAlign w:val="bottom"/>
             <w:hideMark/>
@@ -870,7 +890,6 @@
             <w:tcBorders>
               <w:right w:val="single" w:sz="24" w:space="0" w:color="FF0000"/>
             </w:tcBorders>
-            <w:shd w:val="clear" w:color="auto" w:fill="auto"/>
             <w:noWrap/>
             <w:vAlign w:val="bottom"/>
             <w:hideMark/>
@@ -892,7 +911,27 @@
                 <w:szCs w:val="20"/>
                 <w:lang w:eastAsia="en-GB"/>
               </w:rPr>
-              <w:t>Aina AA, Misquitta, AJ, Price SL, J Chem Phys 2021, 154(9) 094123</w:t>
+              <w:t xml:space="preserve">Aina AA, </w:t>
+            </w:r>
+            <w:proofErr w:type="spellStart"/>
+            <w:r>
+              <w:rPr>
+                <w:rFonts w:ascii="Arial" w:eastAsia="Times New Roman" w:hAnsi="Arial" w:cs="Arial"/>
+                <w:sz w:val="20"/>
+                <w:szCs w:val="20"/>
+                <w:lang w:eastAsia="en-GB"/>
+              </w:rPr>
+              <w:t>Misquitta</w:t>
+            </w:r>
+            <w:proofErr w:type="spellEnd"/>
+            <w:r>
+              <w:rPr>
+                <w:rFonts w:ascii="Arial" w:eastAsia="Times New Roman" w:hAnsi="Arial" w:cs="Arial"/>
+                <w:sz w:val="20"/>
+                <w:szCs w:val="20"/>
+                <w:lang w:eastAsia="en-GB"/>
+              </w:rPr>
+              <w:t>, AJ, Price SL, J Chem Phys 2021, 154(9) 094123</w:t>
             </w:r>
           </w:p>
         </w:tc>
@@ -908,7 +947,6 @@
               <w:left w:val="single" w:sz="24" w:space="0" w:color="FF0000"/>
               <w:bottom w:val="single" w:sz="24" w:space="0" w:color="FF0000"/>
             </w:tcBorders>
-            <w:shd w:val="clear" w:color="auto" w:fill="auto"/>
             <w:noWrap/>
             <w:vAlign w:val="bottom"/>
             <w:hideMark/>
@@ -941,7 +979,6 @@
               <w:bottom w:val="single" w:sz="24" w:space="0" w:color="FF0000"/>
               <w:right w:val="single" w:sz="24" w:space="0" w:color="FF0000"/>
             </w:tcBorders>
-            <w:shd w:val="clear" w:color="auto" w:fill="auto"/>
             <w:noWrap/>
             <w:vAlign w:val="bottom"/>
             <w:hideMark/>
@@ -963,7 +1000,27 @@
                 <w:szCs w:val="20"/>
                 <w:lang w:eastAsia="en-GB"/>
               </w:rPr>
-              <w:t>Rigid CrystalPredictor (2.0.1), DMACRYS (2.2.1.1)</w:t>
+              <w:t xml:space="preserve">Rigid </w:t>
+            </w:r>
+            <w:proofErr w:type="spellStart"/>
+            <w:r>
+              <w:rPr>
+                <w:rFonts w:ascii="Arial" w:eastAsia="Times New Roman" w:hAnsi="Arial" w:cs="Arial"/>
+                <w:sz w:val="20"/>
+                <w:szCs w:val="20"/>
+                <w:lang w:eastAsia="en-GB"/>
+              </w:rPr>
+              <w:t>CrystalPredictor</w:t>
+            </w:r>
+            <w:proofErr w:type="spellEnd"/>
+            <w:r>
+              <w:rPr>
+                <w:rFonts w:ascii="Arial" w:eastAsia="Times New Roman" w:hAnsi="Arial" w:cs="Arial"/>
+                <w:sz w:val="20"/>
+                <w:szCs w:val="20"/>
+                <w:lang w:eastAsia="en-GB"/>
+              </w:rPr>
+              <w:t xml:space="preserve"> (2.0.1), DMACRYS (2.2.1.1)</w:t>
             </w:r>
           </w:p>
         </w:tc>
@@ -979,7 +1036,6 @@
               <w:top w:val="single" w:sz="24" w:space="0" w:color="FF0000"/>
               <w:left w:val="single" w:sz="24" w:space="0" w:color="FF0000"/>
             </w:tcBorders>
-            <w:shd w:val="clear" w:color="auto" w:fill="auto"/>
             <w:noWrap/>
             <w:vAlign w:val="bottom"/>
           </w:tcPr>
@@ -1011,7 +1067,6 @@
               <w:top w:val="single" w:sz="24" w:space="0" w:color="FF0000"/>
               <w:right w:val="single" w:sz="24" w:space="0" w:color="FF0000"/>
             </w:tcBorders>
-            <w:shd w:val="clear" w:color="auto" w:fill="auto"/>
             <w:noWrap/>
             <w:vAlign w:val="bottom"/>
           </w:tcPr>
@@ -1047,7 +1102,6 @@
             <w:tcBorders>
               <w:left w:val="single" w:sz="24" w:space="0" w:color="FF0000"/>
             </w:tcBorders>
-            <w:shd w:val="clear" w:color="auto" w:fill="auto"/>
             <w:noWrap/>
             <w:vAlign w:val="bottom"/>
             <w:hideMark/>
@@ -1062,6 +1116,7 @@
                 <w:lang w:eastAsia="en-GB"/>
               </w:rPr>
             </w:pPr>
+            <w:proofErr w:type="spellStart"/>
             <w:r>
               <w:rPr>
                 <w:rFonts w:ascii="Arial" w:eastAsia="Times New Roman" w:hAnsi="Arial" w:cs="Arial"/>
@@ -1071,6 +1126,7 @@
               </w:rPr>
               <w:t>Study_ID</w:t>
             </w:r>
+            <w:proofErr w:type="spellEnd"/>
           </w:p>
         </w:tc>
         <w:tc>
@@ -1079,7 +1135,6 @@
             <w:tcBorders>
               <w:right w:val="single" w:sz="24" w:space="0" w:color="FF0000"/>
             </w:tcBorders>
-            <w:shd w:val="clear" w:color="auto" w:fill="auto"/>
             <w:noWrap/>
             <w:vAlign w:val="bottom"/>
             <w:hideMark/>
@@ -1116,7 +1171,6 @@
             <w:tcBorders>
               <w:left w:val="single" w:sz="24" w:space="0" w:color="FF0000"/>
             </w:tcBorders>
-            <w:shd w:val="clear" w:color="auto" w:fill="auto"/>
             <w:noWrap/>
             <w:vAlign w:val="bottom"/>
           </w:tcPr>
@@ -1147,7 +1201,6 @@
             <w:tcBorders>
               <w:right w:val="single" w:sz="24" w:space="0" w:color="FF0000"/>
             </w:tcBorders>
-            <w:shd w:val="clear" w:color="auto" w:fill="auto"/>
             <w:noWrap/>
             <w:vAlign w:val="bottom"/>
           </w:tcPr>
@@ -1184,7 +1237,6 @@
               <w:left w:val="single" w:sz="24" w:space="0" w:color="FF0000"/>
               <w:bottom w:val="single" w:sz="24" w:space="0" w:color="FF0000"/>
             </w:tcBorders>
-            <w:shd w:val="clear" w:color="auto" w:fill="auto"/>
             <w:noWrap/>
             <w:vAlign w:val="bottom"/>
           </w:tcPr>
@@ -1216,28 +1268,47 @@
               <w:bottom w:val="single" w:sz="24" w:space="0" w:color="FF0000"/>
               <w:right w:val="single" w:sz="24" w:space="0" w:color="FF0000"/>
             </w:tcBorders>
-            <w:shd w:val="clear" w:color="auto" w:fill="auto"/>
-            <w:noWrap/>
-            <w:vAlign w:val="bottom"/>
-          </w:tcPr>
-          <w:p>
-            <w:pPr>
-              <w:spacing w:after="0" w:line="240" w:lineRule="auto"/>
-              <w:rPr>
-                <w:rFonts w:ascii="Arial" w:eastAsia="Times New Roman" w:hAnsi="Arial" w:cs="Arial"/>
-                <w:sz w:val="20"/>
-                <w:szCs w:val="20"/>
-                <w:lang w:eastAsia="en-GB"/>
-              </w:rPr>
-            </w:pPr>
-            <w:r>
-              <w:rPr>
-                <w:rFonts w:ascii="Arial" w:eastAsia="Times New Roman" w:hAnsi="Arial" w:cs="Arial"/>
-                <w:sz w:val="20"/>
-                <w:szCs w:val="20"/>
-                <w:lang w:eastAsia="en-GB"/>
-              </w:rPr>
-              <w:t>ISA-DMA(PBE0/augA-sadlej) + non-empirical potential with an anisotropic repulsion fit to 2nd order dimer energies and a C10 damped isotropic dispersion, and rank 1 anisotropic polarization model</w:t>
+            <w:noWrap/>
+            <w:vAlign w:val="bottom"/>
+          </w:tcPr>
+          <w:p>
+            <w:pPr>
+              <w:spacing w:after="0" w:line="240" w:lineRule="auto"/>
+              <w:rPr>
+                <w:rFonts w:ascii="Arial" w:eastAsia="Times New Roman" w:hAnsi="Arial" w:cs="Arial"/>
+                <w:sz w:val="20"/>
+                <w:szCs w:val="20"/>
+                <w:lang w:eastAsia="en-GB"/>
+              </w:rPr>
+            </w:pPr>
+            <w:r>
+              <w:rPr>
+                <w:rFonts w:ascii="Arial" w:eastAsia="Times New Roman" w:hAnsi="Arial" w:cs="Arial"/>
+                <w:sz w:val="20"/>
+                <w:szCs w:val="20"/>
+                <w:lang w:eastAsia="en-GB"/>
+              </w:rPr>
+              <w:t>ISA-DMA(PBE0/</w:t>
+            </w:r>
+            <w:proofErr w:type="spellStart"/>
+            <w:r>
+              <w:rPr>
+                <w:rFonts w:ascii="Arial" w:eastAsia="Times New Roman" w:hAnsi="Arial" w:cs="Arial"/>
+                <w:sz w:val="20"/>
+                <w:szCs w:val="20"/>
+                <w:lang w:eastAsia="en-GB"/>
+              </w:rPr>
+              <w:t>augA-sadlej</w:t>
+            </w:r>
+            <w:proofErr w:type="spellEnd"/>
+            <w:r>
+              <w:rPr>
+                <w:rFonts w:ascii="Arial" w:eastAsia="Times New Roman" w:hAnsi="Arial" w:cs="Arial"/>
+                <w:sz w:val="20"/>
+                <w:szCs w:val="20"/>
+                <w:lang w:eastAsia="en-GB"/>
+              </w:rPr>
+              <w:t>) + non-empirical potential with an anisotropic repulsion fit to 2nd order dimer energies and a C10 damped isotropic dispersion, and rank 1 anisotropic polarization model</w:t>
             </w:r>
           </w:p>
         </w:tc>
@@ -1253,7 +1324,6 @@
               <w:top w:val="single" w:sz="24" w:space="0" w:color="FF0000"/>
               <w:left w:val="single" w:sz="24" w:space="0" w:color="FF0000"/>
             </w:tcBorders>
-            <w:shd w:val="clear" w:color="auto" w:fill="auto"/>
             <w:noWrap/>
             <w:vAlign w:val="bottom"/>
           </w:tcPr>
@@ -1285,7 +1355,6 @@
               <w:top w:val="single" w:sz="24" w:space="0" w:color="FF0000"/>
               <w:right w:val="single" w:sz="24" w:space="0" w:color="FF0000"/>
             </w:tcBorders>
-            <w:shd w:val="clear" w:color="auto" w:fill="auto"/>
             <w:noWrap/>
             <w:vAlign w:val="bottom"/>
           </w:tcPr>
@@ -1321,20 +1390,20 @@
             <w:tcBorders>
               <w:left w:val="single" w:sz="24" w:space="0" w:color="FF0000"/>
             </w:tcBorders>
-            <w:shd w:val="clear" w:color="auto" w:fill="auto"/>
-            <w:noWrap/>
-            <w:vAlign w:val="bottom"/>
-          </w:tcPr>
-          <w:p>
-            <w:pPr>
-              <w:spacing w:after="0" w:line="240" w:lineRule="auto"/>
-              <w:rPr>
-                <w:rFonts w:ascii="Arial" w:eastAsia="Times New Roman" w:hAnsi="Arial" w:cs="Arial"/>
-                <w:sz w:val="20"/>
-                <w:szCs w:val="20"/>
-                <w:lang w:eastAsia="en-GB"/>
-              </w:rPr>
-            </w:pPr>
+            <w:noWrap/>
+            <w:vAlign w:val="bottom"/>
+          </w:tcPr>
+          <w:p>
+            <w:pPr>
+              <w:spacing w:after="0" w:line="240" w:lineRule="auto"/>
+              <w:rPr>
+                <w:rFonts w:ascii="Arial" w:eastAsia="Times New Roman" w:hAnsi="Arial" w:cs="Arial"/>
+                <w:sz w:val="20"/>
+                <w:szCs w:val="20"/>
+                <w:lang w:eastAsia="en-GB"/>
+              </w:rPr>
+            </w:pPr>
+            <w:proofErr w:type="spellStart"/>
             <w:r>
               <w:rPr>
                 <w:rFonts w:ascii="Arial" w:hAnsi="Arial" w:cs="Arial"/>
@@ -1343,6 +1412,7 @@
               </w:rPr>
               <w:t>Study_ID</w:t>
             </w:r>
+            <w:proofErr w:type="spellEnd"/>
           </w:p>
         </w:tc>
         <w:tc>
@@ -1351,7 +1421,6 @@
             <w:tcBorders>
               <w:right w:val="single" w:sz="24" w:space="0" w:color="FF0000"/>
             </w:tcBorders>
-            <w:shd w:val="clear" w:color="auto" w:fill="auto"/>
             <w:noWrap/>
             <w:vAlign w:val="bottom"/>
           </w:tcPr>
@@ -1386,7 +1455,6 @@
             <w:tcBorders>
               <w:left w:val="single" w:sz="24" w:space="0" w:color="FF0000"/>
             </w:tcBorders>
-            <w:shd w:val="clear" w:color="auto" w:fill="auto"/>
             <w:noWrap/>
             <w:vAlign w:val="bottom"/>
           </w:tcPr>
@@ -1416,7 +1484,6 @@
             <w:tcBorders>
               <w:right w:val="single" w:sz="24" w:space="0" w:color="FF0000"/>
             </w:tcBorders>
-            <w:shd w:val="clear" w:color="auto" w:fill="auto"/>
             <w:noWrap/>
             <w:vAlign w:val="bottom"/>
           </w:tcPr>
@@ -1436,8 +1503,18 @@
                 <w:sz w:val="20"/>
                 <w:szCs w:val="20"/>
               </w:rPr>
-              <w:t>\CHEMISTRY_CPOSS\Trinitrobenzene\DIFF_no_pol</w:t>
-            </w:r>
+              <w:t>\CHEMISTRY_CPOSS\Trinitrobenzene\</w:t>
+            </w:r>
+            <w:proofErr w:type="spellStart"/>
+            <w:r>
+              <w:rPr>
+                <w:rFonts w:ascii="Arial" w:hAnsi="Arial" w:cs="Arial"/>
+                <w:sz w:val="20"/>
+                <w:szCs w:val="20"/>
+              </w:rPr>
+              <w:t>DIFF_no_pol</w:t>
+            </w:r>
+            <w:proofErr w:type="spellEnd"/>
           </w:p>
         </w:tc>
       </w:tr>
@@ -1452,7 +1529,6 @@
               <w:left w:val="single" w:sz="24" w:space="0" w:color="FF0000"/>
               <w:bottom w:val="single" w:sz="24" w:space="0" w:color="FF0000"/>
             </w:tcBorders>
-            <w:shd w:val="clear" w:color="auto" w:fill="auto"/>
             <w:noWrap/>
             <w:vAlign w:val="bottom"/>
           </w:tcPr>
@@ -1483,7 +1559,6 @@
               <w:bottom w:val="single" w:sz="24" w:space="0" w:color="FF0000"/>
               <w:right w:val="single" w:sz="24" w:space="0" w:color="FF0000"/>
             </w:tcBorders>
-            <w:shd w:val="clear" w:color="auto" w:fill="auto"/>
             <w:noWrap/>
             <w:vAlign w:val="bottom"/>
           </w:tcPr>
@@ -1503,7 +1578,25 @@
                 <w:sz w:val="20"/>
                 <w:szCs w:val="20"/>
               </w:rPr>
-              <w:t>ISA-DMA(PBE0/augA-sadlej) + non-empirical potential with an anisotropic repulsion fit to 2nd order dimer energies and a C10 damped isotropic dispersion, with no polarization model</w:t>
+              <w:t>ISA-DMA(PBE0/</w:t>
+            </w:r>
+            <w:proofErr w:type="spellStart"/>
+            <w:r>
+              <w:rPr>
+                <w:rFonts w:ascii="Arial" w:hAnsi="Arial" w:cs="Arial"/>
+                <w:sz w:val="20"/>
+                <w:szCs w:val="20"/>
+              </w:rPr>
+              <w:t>augA-sadlej</w:t>
+            </w:r>
+            <w:proofErr w:type="spellEnd"/>
+            <w:r>
+              <w:rPr>
+                <w:rFonts w:ascii="Arial" w:hAnsi="Arial" w:cs="Arial"/>
+                <w:sz w:val="20"/>
+                <w:szCs w:val="20"/>
+              </w:rPr>
+              <w:t>) + non-empirical potential with an anisotropic repulsion fit to 2nd order dimer energies and a C10 damped isotropic dispersion, with no polarization model</w:t>
             </w:r>
           </w:p>
         </w:tc>
@@ -1519,7 +1612,6 @@
               <w:top w:val="single" w:sz="24" w:space="0" w:color="FF0000"/>
               <w:left w:val="single" w:sz="24" w:space="0" w:color="FF0000"/>
             </w:tcBorders>
-            <w:shd w:val="clear" w:color="auto" w:fill="auto"/>
             <w:noWrap/>
             <w:vAlign w:val="bottom"/>
           </w:tcPr>
@@ -1551,7 +1643,6 @@
               <w:top w:val="single" w:sz="24" w:space="0" w:color="FF0000"/>
               <w:right w:val="single" w:sz="24" w:space="0" w:color="FF0000"/>
             </w:tcBorders>
-            <w:shd w:val="clear" w:color="auto" w:fill="auto"/>
             <w:noWrap/>
             <w:vAlign w:val="bottom"/>
           </w:tcPr>
@@ -1587,20 +1678,20 @@
             <w:tcBorders>
               <w:left w:val="single" w:sz="24" w:space="0" w:color="FF0000"/>
             </w:tcBorders>
-            <w:shd w:val="clear" w:color="auto" w:fill="auto"/>
-            <w:noWrap/>
-            <w:vAlign w:val="bottom"/>
-          </w:tcPr>
-          <w:p>
-            <w:pPr>
-              <w:spacing w:after="0" w:line="240" w:lineRule="auto"/>
-              <w:rPr>
-                <w:rFonts w:ascii="Arial" w:eastAsia="Times New Roman" w:hAnsi="Arial" w:cs="Arial"/>
-                <w:sz w:val="20"/>
-                <w:szCs w:val="20"/>
-                <w:lang w:eastAsia="en-GB"/>
-              </w:rPr>
-            </w:pPr>
+            <w:noWrap/>
+            <w:vAlign w:val="bottom"/>
+          </w:tcPr>
+          <w:p>
+            <w:pPr>
+              <w:spacing w:after="0" w:line="240" w:lineRule="auto"/>
+              <w:rPr>
+                <w:rFonts w:ascii="Arial" w:eastAsia="Times New Roman" w:hAnsi="Arial" w:cs="Arial"/>
+                <w:sz w:val="20"/>
+                <w:szCs w:val="20"/>
+                <w:lang w:eastAsia="en-GB"/>
+              </w:rPr>
+            </w:pPr>
+            <w:proofErr w:type="spellStart"/>
             <w:r>
               <w:rPr>
                 <w:rFonts w:ascii="Arial" w:hAnsi="Arial" w:cs="Arial"/>
@@ -1609,6 +1700,7 @@
               </w:rPr>
               <w:t>Study_ID</w:t>
             </w:r>
+            <w:proofErr w:type="spellEnd"/>
           </w:p>
         </w:tc>
         <w:tc>
@@ -1617,7 +1709,6 @@
             <w:tcBorders>
               <w:right w:val="single" w:sz="24" w:space="0" w:color="FF0000"/>
             </w:tcBorders>
-            <w:shd w:val="clear" w:color="auto" w:fill="auto"/>
             <w:noWrap/>
             <w:vAlign w:val="bottom"/>
           </w:tcPr>
@@ -1652,7 +1743,6 @@
             <w:tcBorders>
               <w:left w:val="single" w:sz="24" w:space="0" w:color="FF0000"/>
             </w:tcBorders>
-            <w:shd w:val="clear" w:color="auto" w:fill="auto"/>
             <w:noWrap/>
             <w:vAlign w:val="bottom"/>
           </w:tcPr>
@@ -1682,7 +1772,6 @@
             <w:tcBorders>
               <w:right w:val="single" w:sz="24" w:space="0" w:color="FF0000"/>
             </w:tcBorders>
-            <w:shd w:val="clear" w:color="auto" w:fill="auto"/>
             <w:noWrap/>
             <w:vAlign w:val="bottom"/>
           </w:tcPr>
@@ -1718,7 +1807,6 @@
               <w:left w:val="single" w:sz="24" w:space="0" w:color="FF0000"/>
               <w:bottom w:val="single" w:sz="24" w:space="0" w:color="FF0000"/>
             </w:tcBorders>
-            <w:shd w:val="clear" w:color="auto" w:fill="auto"/>
             <w:noWrap/>
             <w:vAlign w:val="bottom"/>
           </w:tcPr>
@@ -1749,7 +1837,6 @@
               <w:bottom w:val="single" w:sz="24" w:space="0" w:color="FF0000"/>
               <w:right w:val="single" w:sz="24" w:space="0" w:color="FF0000"/>
             </w:tcBorders>
-            <w:shd w:val="clear" w:color="auto" w:fill="auto"/>
             <w:noWrap/>
             <w:vAlign w:val="bottom"/>
           </w:tcPr>
@@ -1769,7 +1856,33 @@
                 <w:sz w:val="20"/>
                 <w:szCs w:val="20"/>
               </w:rPr>
-              <w:t>ISA-DMA(PBE0/augA-sadlej) under polarizable continuum model with a dielectric constant of 3 + non-empirical potential with an anisotropic repulsion fit to 2nd order dimer energies and a C10 damped isotropic dispersio</w:t>
+              <w:t>ISA-DMA(PBE0/</w:t>
+            </w:r>
+            <w:proofErr w:type="spellStart"/>
+            <w:r>
+              <w:rPr>
+                <w:rFonts w:ascii="Arial" w:hAnsi="Arial" w:cs="Arial"/>
+                <w:sz w:val="20"/>
+                <w:szCs w:val="20"/>
+              </w:rPr>
+              <w:t>augA-sadlej</w:t>
+            </w:r>
+            <w:proofErr w:type="spellEnd"/>
+            <w:r>
+              <w:rPr>
+                <w:rFonts w:ascii="Arial" w:hAnsi="Arial" w:cs="Arial"/>
+                <w:sz w:val="20"/>
+                <w:szCs w:val="20"/>
+              </w:rPr>
+              <w:t>) under polarizable continuum model with a dielectric constant of 3 + non-empirical potential with an anisotropic repulsion fit to 2nd order dimer energies and a C10 damped isotropic dispersio</w:t>
+            </w:r>
+            <w:r>
+              <w:rPr>
+                <w:rFonts w:ascii="Arial" w:hAnsi="Arial" w:cs="Arial"/>
+                <w:sz w:val="20"/>
+                <w:szCs w:val="20"/>
+              </w:rPr>
+              <w:t>n</w:t>
             </w:r>
           </w:p>
         </w:tc>
@@ -1785,7 +1898,6 @@
               <w:top w:val="single" w:sz="24" w:space="0" w:color="FF0000"/>
               <w:left w:val="single" w:sz="24" w:space="0" w:color="FF0000"/>
             </w:tcBorders>
-            <w:shd w:val="clear" w:color="auto" w:fill="auto"/>
             <w:noWrap/>
             <w:vAlign w:val="bottom"/>
           </w:tcPr>
@@ -1817,7 +1929,6 @@
               <w:top w:val="single" w:sz="24" w:space="0" w:color="FF0000"/>
               <w:right w:val="single" w:sz="24" w:space="0" w:color="FF0000"/>
             </w:tcBorders>
-            <w:shd w:val="clear" w:color="auto" w:fill="auto"/>
             <w:noWrap/>
             <w:vAlign w:val="bottom"/>
           </w:tcPr>
@@ -1853,20 +1964,20 @@
             <w:tcBorders>
               <w:left w:val="single" w:sz="24" w:space="0" w:color="FF0000"/>
             </w:tcBorders>
-            <w:shd w:val="clear" w:color="auto" w:fill="auto"/>
-            <w:noWrap/>
-            <w:vAlign w:val="bottom"/>
-          </w:tcPr>
-          <w:p>
-            <w:pPr>
-              <w:spacing w:after="0" w:line="240" w:lineRule="auto"/>
-              <w:rPr>
-                <w:rFonts w:ascii="Arial" w:eastAsia="Times New Roman" w:hAnsi="Arial" w:cs="Arial"/>
-                <w:sz w:val="20"/>
-                <w:szCs w:val="20"/>
-                <w:lang w:eastAsia="en-GB"/>
-              </w:rPr>
-            </w:pPr>
+            <w:noWrap/>
+            <w:vAlign w:val="bottom"/>
+          </w:tcPr>
+          <w:p>
+            <w:pPr>
+              <w:spacing w:after="0" w:line="240" w:lineRule="auto"/>
+              <w:rPr>
+                <w:rFonts w:ascii="Arial" w:eastAsia="Times New Roman" w:hAnsi="Arial" w:cs="Arial"/>
+                <w:sz w:val="20"/>
+                <w:szCs w:val="20"/>
+                <w:lang w:eastAsia="en-GB"/>
+              </w:rPr>
+            </w:pPr>
+            <w:proofErr w:type="spellStart"/>
             <w:r>
               <w:rPr>
                 <w:rFonts w:ascii="Arial" w:hAnsi="Arial" w:cs="Arial"/>
@@ -1875,6 +1986,7 @@
               </w:rPr>
               <w:t>Study_ID</w:t>
             </w:r>
+            <w:proofErr w:type="spellEnd"/>
           </w:p>
         </w:tc>
         <w:tc>
@@ -1883,7 +1995,6 @@
             <w:tcBorders>
               <w:right w:val="single" w:sz="24" w:space="0" w:color="FF0000"/>
             </w:tcBorders>
-            <w:shd w:val="clear" w:color="auto" w:fill="auto"/>
             <w:noWrap/>
             <w:vAlign w:val="bottom"/>
           </w:tcPr>
@@ -1918,7 +2029,6 @@
             <w:tcBorders>
               <w:left w:val="single" w:sz="24" w:space="0" w:color="FF0000"/>
             </w:tcBorders>
-            <w:shd w:val="clear" w:color="auto" w:fill="auto"/>
             <w:noWrap/>
             <w:vAlign w:val="bottom"/>
           </w:tcPr>
@@ -1948,7 +2058,6 @@
             <w:tcBorders>
               <w:right w:val="single" w:sz="24" w:space="0" w:color="FF0000"/>
             </w:tcBorders>
-            <w:shd w:val="clear" w:color="auto" w:fill="auto"/>
             <w:noWrap/>
             <w:vAlign w:val="bottom"/>
           </w:tcPr>
@@ -1984,7 +2093,6 @@
               <w:left w:val="single" w:sz="24" w:space="0" w:color="FF0000"/>
               <w:bottom w:val="single" w:sz="24" w:space="0" w:color="FF0000"/>
             </w:tcBorders>
-            <w:shd w:val="clear" w:color="auto" w:fill="auto"/>
             <w:noWrap/>
             <w:vAlign w:val="bottom"/>
           </w:tcPr>
@@ -2016,7 +2124,6 @@
               <w:bottom w:val="single" w:sz="24" w:space="0" w:color="FF0000"/>
               <w:right w:val="single" w:sz="24" w:space="0" w:color="FF0000"/>
             </w:tcBorders>
-            <w:shd w:val="clear" w:color="auto" w:fill="auto"/>
             <w:noWrap/>
             <w:vAlign w:val="bottom"/>
           </w:tcPr>
@@ -2036,8 +2143,36 @@
                 <w:sz w:val="20"/>
                 <w:szCs w:val="20"/>
               </w:rPr>
-              <w:t>ISA-DMA(PBE0/augA-sadlej) under polarizable continuum model with a dielectric constant of 7 + non-empirical potential with an anisotropic repulsion fit to 2nd order dimer energies and a C10 damped isotropic dispersio</w:t>
-            </w:r>
+              <w:t>ISA-DMA(PBE0/</w:t>
+            </w:r>
+            <w:proofErr w:type="spellStart"/>
+            <w:r>
+              <w:rPr>
+                <w:rFonts w:ascii="Arial" w:hAnsi="Arial" w:cs="Arial"/>
+                <w:sz w:val="20"/>
+                <w:szCs w:val="20"/>
+              </w:rPr>
+              <w:t>augA-sadlej</w:t>
+            </w:r>
+            <w:proofErr w:type="spellEnd"/>
+            <w:r>
+              <w:rPr>
+                <w:rFonts w:ascii="Arial" w:hAnsi="Arial" w:cs="Arial"/>
+                <w:sz w:val="20"/>
+                <w:szCs w:val="20"/>
+              </w:rPr>
+              <w:t xml:space="preserve">) under polarizable continuum model with a dielectric constant of 7 + non-empirical potential with an anisotropic repulsion fit to 2nd order dimer energies and a C10 damped isotropic </w:t>
+            </w:r>
+            <w:proofErr w:type="spellStart"/>
+            <w:r>
+              <w:rPr>
+                <w:rFonts w:ascii="Arial" w:hAnsi="Arial" w:cs="Arial"/>
+                <w:sz w:val="20"/>
+                <w:szCs w:val="20"/>
+              </w:rPr>
+              <w:t>dispersio</w:t>
+            </w:r>
+            <w:proofErr w:type="spellEnd"/>
           </w:p>
         </w:tc>
       </w:tr>
@@ -2052,7 +2187,6 @@
               <w:top w:val="single" w:sz="24" w:space="0" w:color="FF0000"/>
               <w:left w:val="single" w:sz="24" w:space="0" w:color="FF0000"/>
             </w:tcBorders>
-            <w:shd w:val="clear" w:color="auto" w:fill="auto"/>
             <w:noWrap/>
             <w:vAlign w:val="bottom"/>
           </w:tcPr>
@@ -2084,7 +2218,6 @@
               <w:top w:val="single" w:sz="24" w:space="0" w:color="FF0000"/>
               <w:right w:val="single" w:sz="24" w:space="0" w:color="FF0000"/>
             </w:tcBorders>
-            <w:shd w:val="clear" w:color="auto" w:fill="auto"/>
             <w:noWrap/>
             <w:vAlign w:val="bottom"/>
           </w:tcPr>
@@ -2120,20 +2253,20 @@
             <w:tcBorders>
               <w:left w:val="single" w:sz="24" w:space="0" w:color="FF0000"/>
             </w:tcBorders>
-            <w:shd w:val="clear" w:color="auto" w:fill="auto"/>
-            <w:noWrap/>
-            <w:vAlign w:val="bottom"/>
-          </w:tcPr>
-          <w:p>
-            <w:pPr>
-              <w:spacing w:after="0" w:line="240" w:lineRule="auto"/>
-              <w:rPr>
-                <w:rFonts w:ascii="Arial" w:eastAsia="Times New Roman" w:hAnsi="Arial" w:cs="Arial"/>
-                <w:sz w:val="20"/>
-                <w:szCs w:val="20"/>
-                <w:lang w:eastAsia="en-GB"/>
-              </w:rPr>
-            </w:pPr>
+            <w:noWrap/>
+            <w:vAlign w:val="bottom"/>
+          </w:tcPr>
+          <w:p>
+            <w:pPr>
+              <w:spacing w:after="0" w:line="240" w:lineRule="auto"/>
+              <w:rPr>
+                <w:rFonts w:ascii="Arial" w:eastAsia="Times New Roman" w:hAnsi="Arial" w:cs="Arial"/>
+                <w:sz w:val="20"/>
+                <w:szCs w:val="20"/>
+                <w:lang w:eastAsia="en-GB"/>
+              </w:rPr>
+            </w:pPr>
+            <w:proofErr w:type="spellStart"/>
             <w:r>
               <w:rPr>
                 <w:rFonts w:ascii="Arial" w:hAnsi="Arial" w:cs="Arial"/>
@@ -2142,6 +2275,7 @@
               </w:rPr>
               <w:t>Study_ID</w:t>
             </w:r>
+            <w:proofErr w:type="spellEnd"/>
           </w:p>
         </w:tc>
         <w:tc>
@@ -2150,7 +2284,6 @@
             <w:tcBorders>
               <w:right w:val="single" w:sz="24" w:space="0" w:color="FF0000"/>
             </w:tcBorders>
-            <w:shd w:val="clear" w:color="auto" w:fill="auto"/>
             <w:noWrap/>
             <w:vAlign w:val="bottom"/>
           </w:tcPr>
@@ -2185,7 +2318,6 @@
             <w:tcBorders>
               <w:left w:val="single" w:sz="24" w:space="0" w:color="FF0000"/>
             </w:tcBorders>
-            <w:shd w:val="clear" w:color="auto" w:fill="auto"/>
             <w:noWrap/>
             <w:vAlign w:val="bottom"/>
           </w:tcPr>
@@ -2215,7 +2347,6 @@
             <w:tcBorders>
               <w:right w:val="single" w:sz="24" w:space="0" w:color="FF0000"/>
             </w:tcBorders>
-            <w:shd w:val="clear" w:color="auto" w:fill="auto"/>
             <w:noWrap/>
             <w:vAlign w:val="bottom"/>
           </w:tcPr>
@@ -2251,7 +2382,6 @@
               <w:left w:val="single" w:sz="24" w:space="0" w:color="FF0000"/>
               <w:bottom w:val="single" w:sz="24" w:space="0" w:color="FF0000"/>
             </w:tcBorders>
-            <w:shd w:val="clear" w:color="auto" w:fill="auto"/>
             <w:noWrap/>
             <w:vAlign w:val="bottom"/>
           </w:tcPr>
@@ -2282,7 +2412,6 @@
               <w:bottom w:val="single" w:sz="24" w:space="0" w:color="FF0000"/>
               <w:right w:val="single" w:sz="24" w:space="0" w:color="FF0000"/>
             </w:tcBorders>
-            <w:shd w:val="clear" w:color="auto" w:fill="auto"/>
             <w:noWrap/>
             <w:vAlign w:val="bottom"/>
           </w:tcPr>
@@ -2302,8 +2431,36 @@
                 <w:sz w:val="20"/>
                 <w:szCs w:val="20"/>
               </w:rPr>
-              <w:t>ISA-DMA(PBE0/augA-sadlej) under polarizable continuum model with a dielectric constant of 11 + non-empirical potential with an anisotropic repulsion fit to 2nd order dimer energies and a C10 damped isotropic dispersio</w:t>
-            </w:r>
+              <w:t>ISA-DMA(PBE0/</w:t>
+            </w:r>
+            <w:proofErr w:type="spellStart"/>
+            <w:r>
+              <w:rPr>
+                <w:rFonts w:ascii="Arial" w:hAnsi="Arial" w:cs="Arial"/>
+                <w:sz w:val="20"/>
+                <w:szCs w:val="20"/>
+              </w:rPr>
+              <w:t>augA-sadlej</w:t>
+            </w:r>
+            <w:proofErr w:type="spellEnd"/>
+            <w:r>
+              <w:rPr>
+                <w:rFonts w:ascii="Arial" w:hAnsi="Arial" w:cs="Arial"/>
+                <w:sz w:val="20"/>
+                <w:szCs w:val="20"/>
+              </w:rPr>
+              <w:t xml:space="preserve">) under polarizable continuum model with a dielectric constant of 11 + non-empirical potential with an anisotropic repulsion fit to 2nd order dimer energies and a C10 damped isotropic </w:t>
+            </w:r>
+            <w:proofErr w:type="spellStart"/>
+            <w:r>
+              <w:rPr>
+                <w:rFonts w:ascii="Arial" w:hAnsi="Arial" w:cs="Arial"/>
+                <w:sz w:val="20"/>
+                <w:szCs w:val="20"/>
+              </w:rPr>
+              <w:t>dispersio</w:t>
+            </w:r>
+            <w:proofErr w:type="spellEnd"/>
           </w:p>
         </w:tc>
       </w:tr>
@@ -2318,7 +2475,6 @@
               <w:top w:val="single" w:sz="24" w:space="0" w:color="FF0000"/>
               <w:left w:val="single" w:sz="24" w:space="0" w:color="FF0000"/>
             </w:tcBorders>
-            <w:shd w:val="clear" w:color="auto" w:fill="auto"/>
             <w:noWrap/>
             <w:vAlign w:val="bottom"/>
           </w:tcPr>
@@ -2350,7 +2506,6 @@
               <w:top w:val="single" w:sz="24" w:space="0" w:color="FF0000"/>
               <w:right w:val="single" w:sz="24" w:space="0" w:color="FF0000"/>
             </w:tcBorders>
-            <w:shd w:val="clear" w:color="auto" w:fill="auto"/>
             <w:noWrap/>
             <w:vAlign w:val="bottom"/>
           </w:tcPr>
@@ -2386,20 +2541,20 @@
             <w:tcBorders>
               <w:left w:val="single" w:sz="24" w:space="0" w:color="FF0000"/>
             </w:tcBorders>
-            <w:shd w:val="clear" w:color="auto" w:fill="auto"/>
-            <w:noWrap/>
-            <w:vAlign w:val="bottom"/>
-          </w:tcPr>
-          <w:p>
-            <w:pPr>
-              <w:spacing w:after="0" w:line="240" w:lineRule="auto"/>
-              <w:rPr>
-                <w:rFonts w:ascii="Arial" w:eastAsia="Times New Roman" w:hAnsi="Arial" w:cs="Arial"/>
-                <w:sz w:val="20"/>
-                <w:szCs w:val="20"/>
-                <w:lang w:eastAsia="en-GB"/>
-              </w:rPr>
-            </w:pPr>
+            <w:noWrap/>
+            <w:vAlign w:val="bottom"/>
+          </w:tcPr>
+          <w:p>
+            <w:pPr>
+              <w:spacing w:after="0" w:line="240" w:lineRule="auto"/>
+              <w:rPr>
+                <w:rFonts w:ascii="Arial" w:eastAsia="Times New Roman" w:hAnsi="Arial" w:cs="Arial"/>
+                <w:sz w:val="20"/>
+                <w:szCs w:val="20"/>
+                <w:lang w:eastAsia="en-GB"/>
+              </w:rPr>
+            </w:pPr>
+            <w:proofErr w:type="spellStart"/>
             <w:r>
               <w:rPr>
                 <w:rFonts w:ascii="Arial" w:hAnsi="Arial" w:cs="Arial"/>
@@ -2408,6 +2563,7 @@
               </w:rPr>
               <w:t>Study_ID</w:t>
             </w:r>
+            <w:proofErr w:type="spellEnd"/>
           </w:p>
         </w:tc>
         <w:tc>
@@ -2416,7 +2572,6 @@
             <w:tcBorders>
               <w:right w:val="single" w:sz="24" w:space="0" w:color="FF0000"/>
             </w:tcBorders>
-            <w:shd w:val="clear" w:color="auto" w:fill="auto"/>
             <w:noWrap/>
             <w:vAlign w:val="bottom"/>
           </w:tcPr>
@@ -2451,7 +2606,6 @@
             <w:tcBorders>
               <w:left w:val="single" w:sz="24" w:space="0" w:color="FF0000"/>
             </w:tcBorders>
-            <w:shd w:val="clear" w:color="auto" w:fill="auto"/>
             <w:noWrap/>
             <w:vAlign w:val="bottom"/>
           </w:tcPr>
@@ -2481,7 +2635,6 @@
             <w:tcBorders>
               <w:right w:val="single" w:sz="24" w:space="0" w:color="FF0000"/>
             </w:tcBorders>
-            <w:shd w:val="clear" w:color="auto" w:fill="auto"/>
             <w:noWrap/>
             <w:vAlign w:val="bottom"/>
           </w:tcPr>
@@ -2517,7 +2670,6 @@
               <w:left w:val="single" w:sz="24" w:space="0" w:color="FF0000"/>
               <w:bottom w:val="single" w:sz="24" w:space="0" w:color="FF0000"/>
             </w:tcBorders>
-            <w:shd w:val="clear" w:color="auto" w:fill="auto"/>
             <w:noWrap/>
             <w:vAlign w:val="bottom"/>
           </w:tcPr>
@@ -2548,7 +2700,6 @@
               <w:bottom w:val="single" w:sz="24" w:space="0" w:color="FF0000"/>
               <w:right w:val="single" w:sz="24" w:space="0" w:color="FF0000"/>
             </w:tcBorders>
-            <w:shd w:val="clear" w:color="auto" w:fill="auto"/>
             <w:noWrap/>
             <w:vAlign w:val="bottom"/>
           </w:tcPr>
@@ -2568,7 +2719,25 @@
                 <w:sz w:val="20"/>
                 <w:szCs w:val="20"/>
               </w:rPr>
-              <w:t>ISA-DMA(PBE0/augA-sadlej) + non-empirical potential with an anisotropic repulsion fit to 1st order dimer energies and a C10 damped isotropic dispersion, and rank 1 anisotropic polarization model</w:t>
+              <w:t>ISA-DMA(PBE0/</w:t>
+            </w:r>
+            <w:proofErr w:type="spellStart"/>
+            <w:r>
+              <w:rPr>
+                <w:rFonts w:ascii="Arial" w:hAnsi="Arial" w:cs="Arial"/>
+                <w:sz w:val="20"/>
+                <w:szCs w:val="20"/>
+              </w:rPr>
+              <w:t>augA-sadlej</w:t>
+            </w:r>
+            <w:proofErr w:type="spellEnd"/>
+            <w:r>
+              <w:rPr>
+                <w:rFonts w:ascii="Arial" w:hAnsi="Arial" w:cs="Arial"/>
+                <w:sz w:val="20"/>
+                <w:szCs w:val="20"/>
+              </w:rPr>
+              <w:t>) + non-empirical potential with an anisotropic repulsion fit to 1st order dimer energies and a C10 damped isotropic dispersion, and rank 1 anisotropic polarization model</w:t>
             </w:r>
           </w:p>
         </w:tc>
@@ -2584,7 +2753,6 @@
               <w:top w:val="single" w:sz="24" w:space="0" w:color="FF0000"/>
               <w:left w:val="single" w:sz="24" w:space="0" w:color="FF0000"/>
             </w:tcBorders>
-            <w:shd w:val="clear" w:color="auto" w:fill="auto"/>
             <w:noWrap/>
             <w:vAlign w:val="bottom"/>
           </w:tcPr>
@@ -2616,7 +2784,6 @@
               <w:top w:val="single" w:sz="24" w:space="0" w:color="FF0000"/>
               <w:right w:val="single" w:sz="24" w:space="0" w:color="FF0000"/>
             </w:tcBorders>
-            <w:shd w:val="clear" w:color="auto" w:fill="auto"/>
             <w:noWrap/>
             <w:vAlign w:val="bottom"/>
           </w:tcPr>
@@ -2652,20 +2819,20 @@
             <w:tcBorders>
               <w:left w:val="single" w:sz="24" w:space="0" w:color="FF0000"/>
             </w:tcBorders>
-            <w:shd w:val="clear" w:color="auto" w:fill="auto"/>
-            <w:noWrap/>
-            <w:vAlign w:val="bottom"/>
-          </w:tcPr>
-          <w:p>
-            <w:pPr>
-              <w:spacing w:after="0" w:line="240" w:lineRule="auto"/>
-              <w:rPr>
-                <w:rFonts w:ascii="Arial" w:eastAsia="Times New Roman" w:hAnsi="Arial" w:cs="Arial"/>
-                <w:sz w:val="20"/>
-                <w:szCs w:val="20"/>
-                <w:lang w:eastAsia="en-GB"/>
-              </w:rPr>
-            </w:pPr>
+            <w:noWrap/>
+            <w:vAlign w:val="bottom"/>
+          </w:tcPr>
+          <w:p>
+            <w:pPr>
+              <w:spacing w:after="0" w:line="240" w:lineRule="auto"/>
+              <w:rPr>
+                <w:rFonts w:ascii="Arial" w:eastAsia="Times New Roman" w:hAnsi="Arial" w:cs="Arial"/>
+                <w:sz w:val="20"/>
+                <w:szCs w:val="20"/>
+                <w:lang w:eastAsia="en-GB"/>
+              </w:rPr>
+            </w:pPr>
+            <w:proofErr w:type="spellStart"/>
             <w:r>
               <w:rPr>
                 <w:rFonts w:ascii="Arial" w:hAnsi="Arial" w:cs="Arial"/>
@@ -2674,6 +2841,7 @@
               </w:rPr>
               <w:t>Study_ID</w:t>
             </w:r>
+            <w:proofErr w:type="spellEnd"/>
           </w:p>
         </w:tc>
         <w:tc>
@@ -2682,7 +2850,6 @@
             <w:tcBorders>
               <w:right w:val="single" w:sz="24" w:space="0" w:color="FF0000"/>
             </w:tcBorders>
-            <w:shd w:val="clear" w:color="auto" w:fill="auto"/>
             <w:noWrap/>
             <w:vAlign w:val="bottom"/>
           </w:tcPr>
@@ -2717,7 +2884,6 @@
             <w:tcBorders>
               <w:left w:val="single" w:sz="24" w:space="0" w:color="FF0000"/>
             </w:tcBorders>
-            <w:shd w:val="clear" w:color="auto" w:fill="auto"/>
             <w:noWrap/>
             <w:vAlign w:val="bottom"/>
           </w:tcPr>
@@ -2747,7 +2913,6 @@
             <w:tcBorders>
               <w:right w:val="single" w:sz="24" w:space="0" w:color="FF0000"/>
             </w:tcBorders>
-            <w:shd w:val="clear" w:color="auto" w:fill="auto"/>
             <w:noWrap/>
             <w:vAlign w:val="bottom"/>
           </w:tcPr>
@@ -2783,7 +2948,6 @@
               <w:left w:val="single" w:sz="24" w:space="0" w:color="FF0000"/>
               <w:bottom w:val="single" w:sz="24" w:space="0" w:color="FF0000"/>
             </w:tcBorders>
-            <w:shd w:val="clear" w:color="auto" w:fill="auto"/>
             <w:noWrap/>
             <w:vAlign w:val="bottom"/>
           </w:tcPr>
@@ -2814,7 +2978,6 @@
               <w:bottom w:val="single" w:sz="24" w:space="0" w:color="FF0000"/>
               <w:right w:val="single" w:sz="24" w:space="0" w:color="FF0000"/>
             </w:tcBorders>
-            <w:shd w:val="clear" w:color="auto" w:fill="auto"/>
             <w:noWrap/>
             <w:vAlign w:val="bottom"/>
           </w:tcPr>
@@ -2834,7 +2997,25 @@
                 <w:sz w:val="20"/>
                 <w:szCs w:val="20"/>
               </w:rPr>
-              <w:t>ISA-DMA(PBE0/augA-sadlej) + non-empirical potential with an isotropic repulsion fit to 1st order dimer energies and a C10 damped isotropic dispersion, and rank 1 anisotropic polarization model.</w:t>
+              <w:t>ISA-DMA(PBE0/</w:t>
+            </w:r>
+            <w:proofErr w:type="spellStart"/>
+            <w:r>
+              <w:rPr>
+                <w:rFonts w:ascii="Arial" w:hAnsi="Arial" w:cs="Arial"/>
+                <w:sz w:val="20"/>
+                <w:szCs w:val="20"/>
+              </w:rPr>
+              <w:t>augA-sadlej</w:t>
+            </w:r>
+            <w:proofErr w:type="spellEnd"/>
+            <w:r>
+              <w:rPr>
+                <w:rFonts w:ascii="Arial" w:hAnsi="Arial" w:cs="Arial"/>
+                <w:sz w:val="20"/>
+                <w:szCs w:val="20"/>
+              </w:rPr>
+              <w:t>) + non-empirical potential with an isotropic repulsion fit to 1st order dimer energies and a C10 damped isotropic dispersion, and rank 1 anisotropic polarization model.</w:t>
             </w:r>
           </w:p>
         </w:tc>
@@ -2850,7 +3031,6 @@
               <w:top w:val="single" w:sz="24" w:space="0" w:color="FF0000"/>
               <w:left w:val="single" w:sz="24" w:space="0" w:color="FF0000"/>
             </w:tcBorders>
-            <w:shd w:val="clear" w:color="auto" w:fill="auto"/>
             <w:noWrap/>
             <w:vAlign w:val="bottom"/>
           </w:tcPr>
@@ -2882,7 +3062,6 @@
               <w:top w:val="single" w:sz="24" w:space="0" w:color="FF0000"/>
               <w:right w:val="single" w:sz="24" w:space="0" w:color="FF0000"/>
             </w:tcBorders>
-            <w:shd w:val="clear" w:color="auto" w:fill="auto"/>
             <w:noWrap/>
             <w:vAlign w:val="bottom"/>
           </w:tcPr>
@@ -2918,20 +3097,20 @@
             <w:tcBorders>
               <w:left w:val="single" w:sz="24" w:space="0" w:color="FF0000"/>
             </w:tcBorders>
-            <w:shd w:val="clear" w:color="auto" w:fill="auto"/>
-            <w:noWrap/>
-            <w:vAlign w:val="bottom"/>
-          </w:tcPr>
-          <w:p>
-            <w:pPr>
-              <w:spacing w:after="0" w:line="240" w:lineRule="auto"/>
-              <w:rPr>
-                <w:rFonts w:ascii="Arial" w:eastAsia="Times New Roman" w:hAnsi="Arial" w:cs="Arial"/>
-                <w:sz w:val="20"/>
-                <w:szCs w:val="20"/>
-                <w:lang w:eastAsia="en-GB"/>
-              </w:rPr>
-            </w:pPr>
+            <w:noWrap/>
+            <w:vAlign w:val="bottom"/>
+          </w:tcPr>
+          <w:p>
+            <w:pPr>
+              <w:spacing w:after="0" w:line="240" w:lineRule="auto"/>
+              <w:rPr>
+                <w:rFonts w:ascii="Arial" w:eastAsia="Times New Roman" w:hAnsi="Arial" w:cs="Arial"/>
+                <w:sz w:val="20"/>
+                <w:szCs w:val="20"/>
+                <w:lang w:eastAsia="en-GB"/>
+              </w:rPr>
+            </w:pPr>
+            <w:proofErr w:type="spellStart"/>
             <w:r>
               <w:rPr>
                 <w:rFonts w:ascii="Arial" w:hAnsi="Arial" w:cs="Arial"/>
@@ -2940,6 +3119,7 @@
               </w:rPr>
               <w:t>Study_ID</w:t>
             </w:r>
+            <w:proofErr w:type="spellEnd"/>
           </w:p>
         </w:tc>
         <w:tc>
@@ -2948,7 +3128,6 @@
             <w:tcBorders>
               <w:right w:val="single" w:sz="24" w:space="0" w:color="FF0000"/>
             </w:tcBorders>
-            <w:shd w:val="clear" w:color="auto" w:fill="auto"/>
             <w:noWrap/>
             <w:vAlign w:val="bottom"/>
           </w:tcPr>
@@ -2983,7 +3162,6 @@
             <w:tcBorders>
               <w:left w:val="single" w:sz="24" w:space="0" w:color="FF0000"/>
             </w:tcBorders>
-            <w:shd w:val="clear" w:color="auto" w:fill="auto"/>
             <w:noWrap/>
             <w:vAlign w:val="bottom"/>
           </w:tcPr>
@@ -3013,7 +3191,6 @@
             <w:tcBorders>
               <w:right w:val="single" w:sz="24" w:space="0" w:color="FF0000"/>
             </w:tcBorders>
-            <w:shd w:val="clear" w:color="auto" w:fill="auto"/>
             <w:noWrap/>
             <w:vAlign w:val="bottom"/>
           </w:tcPr>
@@ -3049,7 +3226,6 @@
               <w:left w:val="single" w:sz="24" w:space="0" w:color="FF0000"/>
               <w:bottom w:val="single" w:sz="24" w:space="0" w:color="FF0000"/>
             </w:tcBorders>
-            <w:shd w:val="clear" w:color="auto" w:fill="auto"/>
             <w:noWrap/>
             <w:vAlign w:val="bottom"/>
           </w:tcPr>
@@ -3080,7 +3256,6 @@
               <w:bottom w:val="single" w:sz="24" w:space="0" w:color="FF0000"/>
               <w:right w:val="single" w:sz="24" w:space="0" w:color="FF0000"/>
             </w:tcBorders>
-            <w:shd w:val="clear" w:color="auto" w:fill="auto"/>
             <w:noWrap/>
             <w:vAlign w:val="bottom"/>
           </w:tcPr>
@@ -3100,7 +3275,25 @@
                 <w:sz w:val="20"/>
                 <w:szCs w:val="20"/>
               </w:rPr>
-              <w:t>ISA-DMA(PBE0/augA-sadlej) + FIT</w:t>
+              <w:t>ISA-DMA(PBE0/</w:t>
+            </w:r>
+            <w:proofErr w:type="spellStart"/>
+            <w:r>
+              <w:rPr>
+                <w:rFonts w:ascii="Arial" w:hAnsi="Arial" w:cs="Arial"/>
+                <w:sz w:val="20"/>
+                <w:szCs w:val="20"/>
+              </w:rPr>
+              <w:t>augA-sadlej</w:t>
+            </w:r>
+            <w:proofErr w:type="spellEnd"/>
+            <w:r>
+              <w:rPr>
+                <w:rFonts w:ascii="Arial" w:hAnsi="Arial" w:cs="Arial"/>
+                <w:sz w:val="20"/>
+                <w:szCs w:val="20"/>
+              </w:rPr>
+              <w:t>) + FIT</w:t>
             </w:r>
           </w:p>
         </w:tc>
@@ -3116,7 +3309,6 @@
               <w:top w:val="single" w:sz="24" w:space="0" w:color="FF0000"/>
               <w:left w:val="single" w:sz="24" w:space="0" w:color="FF0000"/>
             </w:tcBorders>
-            <w:shd w:val="clear" w:color="auto" w:fill="auto"/>
             <w:noWrap/>
             <w:vAlign w:val="bottom"/>
           </w:tcPr>
@@ -3148,7 +3340,6 @@
               <w:top w:val="single" w:sz="24" w:space="0" w:color="FF0000"/>
               <w:right w:val="single" w:sz="24" w:space="0" w:color="FF0000"/>
             </w:tcBorders>
-            <w:shd w:val="clear" w:color="auto" w:fill="auto"/>
             <w:noWrap/>
             <w:vAlign w:val="bottom"/>
           </w:tcPr>
@@ -3184,20 +3375,20 @@
             <w:tcBorders>
               <w:left w:val="single" w:sz="24" w:space="0" w:color="FF0000"/>
             </w:tcBorders>
-            <w:shd w:val="clear" w:color="auto" w:fill="auto"/>
-            <w:noWrap/>
-            <w:vAlign w:val="bottom"/>
-          </w:tcPr>
-          <w:p>
-            <w:pPr>
-              <w:spacing w:after="0" w:line="240" w:lineRule="auto"/>
-              <w:rPr>
-                <w:rFonts w:ascii="Arial" w:eastAsia="Times New Roman" w:hAnsi="Arial" w:cs="Arial"/>
-                <w:sz w:val="20"/>
-                <w:szCs w:val="20"/>
-                <w:lang w:eastAsia="en-GB"/>
-              </w:rPr>
-            </w:pPr>
+            <w:noWrap/>
+            <w:vAlign w:val="bottom"/>
+          </w:tcPr>
+          <w:p>
+            <w:pPr>
+              <w:spacing w:after="0" w:line="240" w:lineRule="auto"/>
+              <w:rPr>
+                <w:rFonts w:ascii="Arial" w:eastAsia="Times New Roman" w:hAnsi="Arial" w:cs="Arial"/>
+                <w:sz w:val="20"/>
+                <w:szCs w:val="20"/>
+                <w:lang w:eastAsia="en-GB"/>
+              </w:rPr>
+            </w:pPr>
+            <w:proofErr w:type="spellStart"/>
             <w:r>
               <w:rPr>
                 <w:rFonts w:ascii="Arial" w:hAnsi="Arial" w:cs="Arial"/>
@@ -3206,6 +3397,7 @@
               </w:rPr>
               <w:t>Study_ID</w:t>
             </w:r>
+            <w:proofErr w:type="spellEnd"/>
           </w:p>
         </w:tc>
         <w:tc>
@@ -3214,7 +3406,6 @@
             <w:tcBorders>
               <w:right w:val="single" w:sz="24" w:space="0" w:color="FF0000"/>
             </w:tcBorders>
-            <w:shd w:val="clear" w:color="auto" w:fill="auto"/>
             <w:noWrap/>
             <w:vAlign w:val="bottom"/>
           </w:tcPr>
@@ -3249,7 +3440,6 @@
             <w:tcBorders>
               <w:left w:val="single" w:sz="24" w:space="0" w:color="FF0000"/>
             </w:tcBorders>
-            <w:shd w:val="clear" w:color="auto" w:fill="auto"/>
             <w:noWrap/>
             <w:vAlign w:val="bottom"/>
           </w:tcPr>
@@ -3279,7 +3469,6 @@
             <w:tcBorders>
               <w:right w:val="single" w:sz="24" w:space="0" w:color="FF0000"/>
             </w:tcBorders>
-            <w:shd w:val="clear" w:color="auto" w:fill="auto"/>
             <w:noWrap/>
             <w:vAlign w:val="bottom"/>
           </w:tcPr>
@@ -3315,7 +3504,6 @@
               <w:left w:val="single" w:sz="24" w:space="0" w:color="FF0000"/>
               <w:bottom w:val="single" w:sz="24" w:space="0" w:color="FF0000"/>
             </w:tcBorders>
-            <w:shd w:val="clear" w:color="auto" w:fill="auto"/>
             <w:noWrap/>
             <w:vAlign w:val="bottom"/>
           </w:tcPr>
@@ -3346,7 +3534,6 @@
               <w:bottom w:val="single" w:sz="24" w:space="0" w:color="FF0000"/>
               <w:right w:val="single" w:sz="24" w:space="0" w:color="FF0000"/>
             </w:tcBorders>
-            <w:shd w:val="clear" w:color="auto" w:fill="auto"/>
             <w:noWrap/>
             <w:vAlign w:val="bottom"/>
           </w:tcPr>
@@ -3366,7 +3553,27 @@
                 <w:sz w:val="20"/>
                 <w:szCs w:val="20"/>
               </w:rPr>
-              <w:t>GDMA(PBE0/6-31(d,p)) + FIT</w:t>
+              <w:t>GDMA(PBE0/6-31(</w:t>
+            </w:r>
+            <w:proofErr w:type="spellStart"/>
+            <w:proofErr w:type="gramStart"/>
+            <w:r>
+              <w:rPr>
+                <w:rFonts w:ascii="Arial" w:hAnsi="Arial" w:cs="Arial"/>
+                <w:sz w:val="20"/>
+                <w:szCs w:val="20"/>
+              </w:rPr>
+              <w:t>d,p</w:t>
+            </w:r>
+            <w:proofErr w:type="spellEnd"/>
+            <w:proofErr w:type="gramEnd"/>
+            <w:r>
+              <w:rPr>
+                <w:rFonts w:ascii="Arial" w:hAnsi="Arial" w:cs="Arial"/>
+                <w:sz w:val="20"/>
+                <w:szCs w:val="20"/>
+              </w:rPr>
+              <w:t>)) + FIT</w:t>
             </w:r>
           </w:p>
         </w:tc>
@@ -3832,6 +4039,7 @@
                 <w:lang w:val="en-US"/>
               </w:rPr>
             </w:pPr>
+            <w:proofErr w:type="spellStart"/>
             <w:r>
               <w:rPr>
                 <w:rFonts w:ascii="Aptos Narrow" w:hAnsi="Aptos Narrow"/>
@@ -3839,6 +4047,7 @@
               </w:rPr>
               <w:t>Pbca</w:t>
             </w:r>
+            <w:proofErr w:type="spellEnd"/>
           </w:p>
         </w:tc>
         <w:tc>
@@ -4101,6 +4310,7 @@
                 <w:lang w:val="en-US"/>
               </w:rPr>
             </w:pPr>
+            <w:proofErr w:type="spellStart"/>
             <w:r>
               <w:rPr>
                 <w:rFonts w:ascii="Aptos Narrow" w:hAnsi="Aptos Narrow"/>
@@ -4108,6 +4318,7 @@
               </w:rPr>
               <w:t>Pbca</w:t>
             </w:r>
+            <w:proofErr w:type="spellEnd"/>
           </w:p>
         </w:tc>
         <w:tc>
@@ -4935,6 +5146,7 @@
                 <w:lang w:val="en-US"/>
               </w:rPr>
             </w:pPr>
+            <w:proofErr w:type="spellStart"/>
             <w:r>
               <w:rPr>
                 <w:rFonts w:ascii="Aptos Narrow" w:hAnsi="Aptos Narrow"/>
@@ -4942,6 +5154,7 @@
               </w:rPr>
               <w:t>Pbca</w:t>
             </w:r>
+            <w:proofErr w:type="spellEnd"/>
           </w:p>
         </w:tc>
         <w:tc>
@@ -5352,6 +5565,7 @@
                 <w:lang w:val="en-US"/>
               </w:rPr>
             </w:pPr>
+            <w:proofErr w:type="spellStart"/>
             <w:r>
               <w:rPr>
                 <w:rFonts w:ascii="Aptos Narrow" w:hAnsi="Aptos Narrow"/>
@@ -5359,6 +5573,7 @@
               </w:rPr>
               <w:t>Pbca</w:t>
             </w:r>
+            <w:proofErr w:type="spellEnd"/>
           </w:p>
         </w:tc>
         <w:tc>
@@ -5514,6 +5729,7 @@
                 <w:lang w:val="en-US"/>
               </w:rPr>
             </w:pPr>
+            <w:proofErr w:type="spellStart"/>
             <w:r>
               <w:rPr>
                 <w:rFonts w:ascii="Aptos Narrow" w:hAnsi="Aptos Narrow"/>
@@ -5521,6 +5737,7 @@
               </w:rPr>
               <w:t>Pbca</w:t>
             </w:r>
+            <w:proofErr w:type="spellEnd"/>
           </w:p>
         </w:tc>
         <w:tc>
@@ -6000,6 +6217,7 @@
                 <w:lang w:val="en-US"/>
               </w:rPr>
             </w:pPr>
+            <w:proofErr w:type="spellStart"/>
             <w:r>
               <w:rPr>
                 <w:rFonts w:ascii="Aptos Narrow" w:hAnsi="Aptos Narrow"/>
@@ -6007,6 +6225,7 @@
               </w:rPr>
               <w:t>Pbca</w:t>
             </w:r>
+            <w:proofErr w:type="spellEnd"/>
           </w:p>
         </w:tc>
         <w:tc>
@@ -6088,7 +6307,23 @@
                 <w:rFonts w:ascii="Calibri" w:hAnsi="Calibri" w:cs="Calibri"/>
                 <w:color w:val="000000"/>
               </w:rPr>
-              <w:t>Not recorded (cocrystallization paper)</w:t>
+              <w:t>Not recorded (</w:t>
+            </w:r>
+            <w:proofErr w:type="spellStart"/>
+            <w:r>
+              <w:rPr>
+                <w:rFonts w:ascii="Calibri" w:hAnsi="Calibri" w:cs="Calibri"/>
+                <w:color w:val="000000"/>
+              </w:rPr>
+              <w:t>cocrystallization</w:t>
+            </w:r>
+            <w:proofErr w:type="spellEnd"/>
+            <w:r>
+              <w:rPr>
+                <w:rFonts w:ascii="Calibri" w:hAnsi="Calibri" w:cs="Calibri"/>
+                <w:color w:val="000000"/>
+              </w:rPr>
+              <w:t xml:space="preserve"> paper)</w:t>
             </w:r>
             <w:r>
               <w:rPr>

</xml_diff>